<commit_message>
Created 07_05_2026, 08_05_2026 thess folders and inside those folders crated Hands_On_Practical_&_Steps this word file, updated steps in it and also updated README.md file in same folders and added terraform code in 06_05_2026 this folder, it was missing earlier.
</commit_message>
<xml_diff>
--- a/07_05_2026/Hands_On_Practical_&_Steps.docx
+++ b/07_05_2026/Hands_On_Practical_&_Steps.docx
@@ -25,7 +25,553 @@
           <w:numId w:val="1"/>
         </w:numPr>
       </w:pPr>
+      <w:r>
+        <w:t xml:space="preserve">Verified my </w:t>
+      </w:r>
+      <w:r>
+        <w:t xml:space="preserve">credentials </w:t>
+      </w:r>
+      <w:r>
+        <w:t xml:space="preserve">or terraform profile </w:t>
+      </w:r>
+      <w:r>
+        <w:t>using the following command:</w:t>
+      </w:r>
+      <w:r>
+        <w:t xml:space="preserve"> </w:t>
+      </w:r>
     </w:p>
+    <w:p>
+      <w:pPr>
+        <w:pStyle w:val="ListParagraph"/>
+        <w:ind w:left="360"/>
+        <w:rPr>
+          <w:b/>
+          <w:bCs/>
+        </w:rPr>
+      </w:pPr>
+      <w:r>
+        <w:rPr>
+          <w:b/>
+          <w:bCs/>
+        </w:rPr>
+        <w:t xml:space="preserve">aws sts get-caller-identity --profile </w:t>
+      </w:r>
+      <w:r>
+        <w:rPr>
+          <w:b/>
+          <w:bCs/>
+        </w:rPr>
+        <w:t>&lt;</w:t>
+      </w:r>
+      <w:r>
+        <w:rPr>
+          <w:b/>
+          <w:bCs/>
+        </w:rPr>
+        <w:t>profile-name</w:t>
+      </w:r>
+      <w:r>
+        <w:rPr>
+          <w:b/>
+          <w:bCs/>
+        </w:rPr>
+        <w:t>&gt;</w:t>
+      </w:r>
+    </w:p>
+    <w:p>
+      <w:pPr>
+        <w:pStyle w:val="ListParagraph"/>
+        <w:numPr>
+          <w:ilvl w:val="0"/>
+          <w:numId w:val="1"/>
+        </w:numPr>
+      </w:pPr>
+      <w:r>
+        <w:t xml:space="preserve">Write the terraform code for this practical. </w:t>
+      </w:r>
+    </w:p>
+    <w:p>
+      <w:pPr>
+        <w:pStyle w:val="ListParagraph"/>
+        <w:numPr>
+          <w:ilvl w:val="0"/>
+          <w:numId w:val="1"/>
+        </w:numPr>
+      </w:pPr>
+      <w:r>
+        <w:t xml:space="preserve">Run </w:t>
+      </w:r>
+      <w:r>
+        <w:rPr>
+          <w:b/>
+          <w:bCs/>
+        </w:rPr>
+        <w:t>terraform init</w:t>
+      </w:r>
+      <w:r>
+        <w:t xml:space="preserve"> command</w:t>
+      </w:r>
+    </w:p>
+    <w:p>
+      <w:r>
+        <w:drawing>
+          <wp:inline distT="0" distB="0" distL="0" distR="0" wp14:anchorId="3E7E297C" wp14:editId="69690745">
+            <wp:extent cx="5731510" cy="3317240"/>
+            <wp:effectExtent l="0" t="0" r="2540" b="0"/>
+            <wp:docPr id="80793584" name="Picture 1"/>
+            <wp:cNvGraphicFramePr>
+              <a:graphicFrameLocks xmlns:a="http://schemas.openxmlformats.org/drawingml/2006/main" noChangeAspect="1"/>
+            </wp:cNvGraphicFramePr>
+            <a:graphic xmlns:a="http://schemas.openxmlformats.org/drawingml/2006/main">
+              <a:graphicData uri="http://schemas.openxmlformats.org/drawingml/2006/picture">
+                <pic:pic xmlns:pic="http://schemas.openxmlformats.org/drawingml/2006/picture">
+                  <pic:nvPicPr>
+                    <pic:cNvPr id="80793584" name=""/>
+                    <pic:cNvPicPr/>
+                  </pic:nvPicPr>
+                  <pic:blipFill>
+                    <a:blip r:embed="rId5"/>
+                    <a:stretch>
+                      <a:fillRect/>
+                    </a:stretch>
+                  </pic:blipFill>
+                  <pic:spPr>
+                    <a:xfrm>
+                      <a:off x="0" y="0"/>
+                      <a:ext cx="5731510" cy="3317240"/>
+                    </a:xfrm>
+                    <a:prstGeom prst="rect">
+                      <a:avLst/>
+                    </a:prstGeom>
+                  </pic:spPr>
+                </pic:pic>
+              </a:graphicData>
+            </a:graphic>
+          </wp:inline>
+        </w:drawing>
+      </w:r>
+    </w:p>
+    <w:p/>
+    <w:p>
+      <w:r>
+        <w:drawing>
+          <wp:inline distT="0" distB="0" distL="0" distR="0" wp14:anchorId="6CD672C2" wp14:editId="66CD52D7">
+            <wp:extent cx="5731510" cy="3058160"/>
+            <wp:effectExtent l="0" t="0" r="2540" b="8890"/>
+            <wp:docPr id="1984936636" name="Picture 1"/>
+            <wp:cNvGraphicFramePr>
+              <a:graphicFrameLocks xmlns:a="http://schemas.openxmlformats.org/drawingml/2006/main" noChangeAspect="1"/>
+            </wp:cNvGraphicFramePr>
+            <a:graphic xmlns:a="http://schemas.openxmlformats.org/drawingml/2006/main">
+              <a:graphicData uri="http://schemas.openxmlformats.org/drawingml/2006/picture">
+                <pic:pic xmlns:pic="http://schemas.openxmlformats.org/drawingml/2006/picture">
+                  <pic:nvPicPr>
+                    <pic:cNvPr id="1984936636" name=""/>
+                    <pic:cNvPicPr/>
+                  </pic:nvPicPr>
+                  <pic:blipFill>
+                    <a:blip r:embed="rId6"/>
+                    <a:stretch>
+                      <a:fillRect/>
+                    </a:stretch>
+                  </pic:blipFill>
+                  <pic:spPr>
+                    <a:xfrm>
+                      <a:off x="0" y="0"/>
+                      <a:ext cx="5731510" cy="3058160"/>
+                    </a:xfrm>
+                    <a:prstGeom prst="rect">
+                      <a:avLst/>
+                    </a:prstGeom>
+                  </pic:spPr>
+                </pic:pic>
+              </a:graphicData>
+            </a:graphic>
+          </wp:inline>
+        </w:drawing>
+      </w:r>
+    </w:p>
+    <w:p>
+      <w:pPr>
+        <w:pStyle w:val="ListParagraph"/>
+        <w:numPr>
+          <w:ilvl w:val="0"/>
+          <w:numId w:val="1"/>
+        </w:numPr>
+      </w:pPr>
+      <w:r>
+        <w:t xml:space="preserve">Run </w:t>
+      </w:r>
+      <w:r>
+        <w:rPr>
+          <w:b/>
+          <w:bCs/>
+        </w:rPr>
+        <w:t xml:space="preserve">terraform </w:t>
+      </w:r>
+      <w:r>
+        <w:rPr>
+          <w:b/>
+          <w:bCs/>
+        </w:rPr>
+        <w:t>validate</w:t>
+      </w:r>
+      <w:r>
+        <w:t xml:space="preserve"> command</w:t>
+      </w:r>
+    </w:p>
+    <w:p>
+      <w:r>
+        <w:lastRenderedPageBreak/>
+        <w:drawing>
+          <wp:inline distT="0" distB="0" distL="0" distR="0" wp14:anchorId="39D1AE9E" wp14:editId="1EB83FDC">
+            <wp:extent cx="5731510" cy="405130"/>
+            <wp:effectExtent l="0" t="0" r="2540" b="0"/>
+            <wp:docPr id="1705776882" name="Picture 1"/>
+            <wp:cNvGraphicFramePr>
+              <a:graphicFrameLocks xmlns:a="http://schemas.openxmlformats.org/drawingml/2006/main" noChangeAspect="1"/>
+            </wp:cNvGraphicFramePr>
+            <a:graphic xmlns:a="http://schemas.openxmlformats.org/drawingml/2006/main">
+              <a:graphicData uri="http://schemas.openxmlformats.org/drawingml/2006/picture">
+                <pic:pic xmlns:pic="http://schemas.openxmlformats.org/drawingml/2006/picture">
+                  <pic:nvPicPr>
+                    <pic:cNvPr id="1705776882" name=""/>
+                    <pic:cNvPicPr/>
+                  </pic:nvPicPr>
+                  <pic:blipFill>
+                    <a:blip r:embed="rId7"/>
+                    <a:stretch>
+                      <a:fillRect/>
+                    </a:stretch>
+                  </pic:blipFill>
+                  <pic:spPr>
+                    <a:xfrm>
+                      <a:off x="0" y="0"/>
+                      <a:ext cx="5731510" cy="405130"/>
+                    </a:xfrm>
+                    <a:prstGeom prst="rect">
+                      <a:avLst/>
+                    </a:prstGeom>
+                  </pic:spPr>
+                </pic:pic>
+              </a:graphicData>
+            </a:graphic>
+          </wp:inline>
+        </w:drawing>
+      </w:r>
+    </w:p>
+    <w:p>
+      <w:pPr>
+        <w:pStyle w:val="ListParagraph"/>
+        <w:numPr>
+          <w:ilvl w:val="0"/>
+          <w:numId w:val="1"/>
+        </w:numPr>
+      </w:pPr>
+      <w:r>
+        <w:t xml:space="preserve">Run </w:t>
+      </w:r>
+      <w:r>
+        <w:rPr>
+          <w:b/>
+          <w:bCs/>
+        </w:rPr>
+        <w:t xml:space="preserve">terraform </w:t>
+      </w:r>
+      <w:r>
+        <w:rPr>
+          <w:b/>
+          <w:bCs/>
+        </w:rPr>
+        <w:t>plan</w:t>
+      </w:r>
+      <w:r>
+        <w:t xml:space="preserve"> command</w:t>
+      </w:r>
+    </w:p>
+    <w:p>
+      <w:r>
+        <w:drawing>
+          <wp:inline distT="0" distB="0" distL="0" distR="0" wp14:anchorId="711C3133" wp14:editId="43E81683">
+            <wp:extent cx="5731510" cy="3769995"/>
+            <wp:effectExtent l="0" t="0" r="2540" b="1905"/>
+            <wp:docPr id="884890044" name="Picture 1"/>
+            <wp:cNvGraphicFramePr>
+              <a:graphicFrameLocks xmlns:a="http://schemas.openxmlformats.org/drawingml/2006/main" noChangeAspect="1"/>
+            </wp:cNvGraphicFramePr>
+            <a:graphic xmlns:a="http://schemas.openxmlformats.org/drawingml/2006/main">
+              <a:graphicData uri="http://schemas.openxmlformats.org/drawingml/2006/picture">
+                <pic:pic xmlns:pic="http://schemas.openxmlformats.org/drawingml/2006/picture">
+                  <pic:nvPicPr>
+                    <pic:cNvPr id="884890044" name=""/>
+                    <pic:cNvPicPr/>
+                  </pic:nvPicPr>
+                  <pic:blipFill>
+                    <a:blip r:embed="rId8"/>
+                    <a:stretch>
+                      <a:fillRect/>
+                    </a:stretch>
+                  </pic:blipFill>
+                  <pic:spPr>
+                    <a:xfrm>
+                      <a:off x="0" y="0"/>
+                      <a:ext cx="5731510" cy="3769995"/>
+                    </a:xfrm>
+                    <a:prstGeom prst="rect">
+                      <a:avLst/>
+                    </a:prstGeom>
+                  </pic:spPr>
+                </pic:pic>
+              </a:graphicData>
+            </a:graphic>
+          </wp:inline>
+        </w:drawing>
+      </w:r>
+    </w:p>
+    <w:p>
+      <w:r>
+        <w:drawing>
+          <wp:inline distT="0" distB="0" distL="0" distR="0" wp14:anchorId="05DE582F" wp14:editId="3E77E4F6">
+            <wp:extent cx="5731510" cy="3529965"/>
+            <wp:effectExtent l="0" t="0" r="2540" b="0"/>
+            <wp:docPr id="457651005" name="Picture 1"/>
+            <wp:cNvGraphicFramePr>
+              <a:graphicFrameLocks xmlns:a="http://schemas.openxmlformats.org/drawingml/2006/main" noChangeAspect="1"/>
+            </wp:cNvGraphicFramePr>
+            <a:graphic xmlns:a="http://schemas.openxmlformats.org/drawingml/2006/main">
+              <a:graphicData uri="http://schemas.openxmlformats.org/drawingml/2006/picture">
+                <pic:pic xmlns:pic="http://schemas.openxmlformats.org/drawingml/2006/picture">
+                  <pic:nvPicPr>
+                    <pic:cNvPr id="457651005" name=""/>
+                    <pic:cNvPicPr/>
+                  </pic:nvPicPr>
+                  <pic:blipFill>
+                    <a:blip r:embed="rId9"/>
+                    <a:stretch>
+                      <a:fillRect/>
+                    </a:stretch>
+                  </pic:blipFill>
+                  <pic:spPr>
+                    <a:xfrm>
+                      <a:off x="0" y="0"/>
+                      <a:ext cx="5731510" cy="3529965"/>
+                    </a:xfrm>
+                    <a:prstGeom prst="rect">
+                      <a:avLst/>
+                    </a:prstGeom>
+                  </pic:spPr>
+                </pic:pic>
+              </a:graphicData>
+            </a:graphic>
+          </wp:inline>
+        </w:drawing>
+      </w:r>
+    </w:p>
+    <w:p/>
+    <w:p>
+      <w:pPr>
+        <w:pStyle w:val="ListParagraph"/>
+        <w:numPr>
+          <w:ilvl w:val="0"/>
+          <w:numId w:val="1"/>
+        </w:numPr>
+      </w:pPr>
+      <w:r>
+        <w:lastRenderedPageBreak/>
+        <w:t xml:space="preserve">Run </w:t>
+      </w:r>
+      <w:r>
+        <w:rPr>
+          <w:b/>
+          <w:bCs/>
+        </w:rPr>
+        <w:t xml:space="preserve">terraform </w:t>
+      </w:r>
+      <w:r>
+        <w:rPr>
+          <w:b/>
+          <w:bCs/>
+        </w:rPr>
+        <w:t>apply</w:t>
+      </w:r>
+      <w:r>
+        <w:t xml:space="preserve"> command</w:t>
+      </w:r>
+    </w:p>
+    <w:p>
+      <w:r>
+        <w:drawing>
+          <wp:inline distT="0" distB="0" distL="0" distR="0" wp14:anchorId="2708DC7D" wp14:editId="260F6581">
+            <wp:extent cx="5731510" cy="3580130"/>
+            <wp:effectExtent l="0" t="0" r="2540" b="1270"/>
+            <wp:docPr id="1398212593" name="Picture 1"/>
+            <wp:cNvGraphicFramePr>
+              <a:graphicFrameLocks xmlns:a="http://schemas.openxmlformats.org/drawingml/2006/main" noChangeAspect="1"/>
+            </wp:cNvGraphicFramePr>
+            <a:graphic xmlns:a="http://schemas.openxmlformats.org/drawingml/2006/main">
+              <a:graphicData uri="http://schemas.openxmlformats.org/drawingml/2006/picture">
+                <pic:pic xmlns:pic="http://schemas.openxmlformats.org/drawingml/2006/picture">
+                  <pic:nvPicPr>
+                    <pic:cNvPr id="1398212593" name=""/>
+                    <pic:cNvPicPr/>
+                  </pic:nvPicPr>
+                  <pic:blipFill>
+                    <a:blip r:embed="rId10"/>
+                    <a:stretch>
+                      <a:fillRect/>
+                    </a:stretch>
+                  </pic:blipFill>
+                  <pic:spPr>
+                    <a:xfrm>
+                      <a:off x="0" y="0"/>
+                      <a:ext cx="5731510" cy="3580130"/>
+                    </a:xfrm>
+                    <a:prstGeom prst="rect">
+                      <a:avLst/>
+                    </a:prstGeom>
+                  </pic:spPr>
+                </pic:pic>
+              </a:graphicData>
+            </a:graphic>
+          </wp:inline>
+        </w:drawing>
+      </w:r>
+    </w:p>
+    <w:p/>
+    <w:p>
+      <w:r>
+        <w:drawing>
+          <wp:inline distT="0" distB="0" distL="0" distR="0" wp14:anchorId="19A8D846" wp14:editId="3399F9DD">
+            <wp:extent cx="5731510" cy="3218815"/>
+            <wp:effectExtent l="0" t="0" r="2540" b="635"/>
+            <wp:docPr id="913454208" name="Picture 1"/>
+            <wp:cNvGraphicFramePr>
+              <a:graphicFrameLocks xmlns:a="http://schemas.openxmlformats.org/drawingml/2006/main" noChangeAspect="1"/>
+            </wp:cNvGraphicFramePr>
+            <a:graphic xmlns:a="http://schemas.openxmlformats.org/drawingml/2006/main">
+              <a:graphicData uri="http://schemas.openxmlformats.org/drawingml/2006/picture">
+                <pic:pic xmlns:pic="http://schemas.openxmlformats.org/drawingml/2006/picture">
+                  <pic:nvPicPr>
+                    <pic:cNvPr id="913454208" name=""/>
+                    <pic:cNvPicPr/>
+                  </pic:nvPicPr>
+                  <pic:blipFill>
+                    <a:blip r:embed="rId11"/>
+                    <a:stretch>
+                      <a:fillRect/>
+                    </a:stretch>
+                  </pic:blipFill>
+                  <pic:spPr>
+                    <a:xfrm>
+                      <a:off x="0" y="0"/>
+                      <a:ext cx="5731510" cy="3218815"/>
+                    </a:xfrm>
+                    <a:prstGeom prst="rect">
+                      <a:avLst/>
+                    </a:prstGeom>
+                  </pic:spPr>
+                </pic:pic>
+              </a:graphicData>
+            </a:graphic>
+          </wp:inline>
+        </w:drawing>
+      </w:r>
+    </w:p>
+    <w:p/>
+    <w:p/>
+    <w:p>
+      <w:r>
+        <w:lastRenderedPageBreak/>
+        <w:drawing>
+          <wp:inline distT="0" distB="0" distL="0" distR="0" wp14:anchorId="2FF3AF17" wp14:editId="606AAA11">
+            <wp:extent cx="5731510" cy="3032125"/>
+            <wp:effectExtent l="0" t="0" r="2540" b="0"/>
+            <wp:docPr id="2085838623" name="Picture 1"/>
+            <wp:cNvGraphicFramePr>
+              <a:graphicFrameLocks xmlns:a="http://schemas.openxmlformats.org/drawingml/2006/main" noChangeAspect="1"/>
+            </wp:cNvGraphicFramePr>
+            <a:graphic xmlns:a="http://schemas.openxmlformats.org/drawingml/2006/main">
+              <a:graphicData uri="http://schemas.openxmlformats.org/drawingml/2006/picture">
+                <pic:pic xmlns:pic="http://schemas.openxmlformats.org/drawingml/2006/picture">
+                  <pic:nvPicPr>
+                    <pic:cNvPr id="2085838623" name=""/>
+                    <pic:cNvPicPr/>
+                  </pic:nvPicPr>
+                  <pic:blipFill>
+                    <a:blip r:embed="rId12"/>
+                    <a:stretch>
+                      <a:fillRect/>
+                    </a:stretch>
+                  </pic:blipFill>
+                  <pic:spPr>
+                    <a:xfrm>
+                      <a:off x="0" y="0"/>
+                      <a:ext cx="5731510" cy="3032125"/>
+                    </a:xfrm>
+                    <a:prstGeom prst="rect">
+                      <a:avLst/>
+                    </a:prstGeom>
+                  </pic:spPr>
+                </pic:pic>
+              </a:graphicData>
+            </a:graphic>
+          </wp:inline>
+        </w:drawing>
+      </w:r>
+    </w:p>
+    <w:p>
+      <w:r>
+        <w:rPr>
+          <w:b/>
+          <w:bCs/>
+        </w:rPr>
+        <w:t>Note:-</w:t>
+      </w:r>
+      <w:r>
+        <w:t xml:space="preserve"> </w:t>
+      </w:r>
+      <w:r>
+        <w:t>When I first ran the terraform apply command, I got a permission error for S3 bucket creation because my IAM user did not have the required S3 permissions</w:t>
+      </w:r>
+      <w:r>
+        <w:t xml:space="preserve"> </w:t>
+      </w:r>
+      <w:r>
+        <w:t xml:space="preserve">assigned. Due to this, the terraform apply command was not successful, and only the </w:t>
+      </w:r>
+      <w:r>
+        <w:rPr>
+          <w:b/>
+          <w:bCs/>
+        </w:rPr>
+        <w:t>random_string</w:t>
+      </w:r>
+      <w:r>
+        <w:t xml:space="preserve"> code block executed successfully during that run.</w:t>
+      </w:r>
+    </w:p>
+    <w:p>
+      <w:r>
+        <w:t>After that, I added the required S3 permissions to my IAM user and reran the terraform apply command. The second time, the command executed successfully, and the S3 bucket was created with the required configuration.</w:t>
+      </w:r>
+    </w:p>
+    <w:p>
+      <w:r>
+        <w:t xml:space="preserve">As I mentioned earlier, the </w:t>
+      </w:r>
+      <w:r>
+        <w:rPr>
+          <w:b/>
+          <w:bCs/>
+        </w:rPr>
+        <w:t>random_string</w:t>
+      </w:r>
+      <w:r>
+        <w:t xml:space="preserve"> code block had already executed successfully during the previous terraform apply command. Because of that, in the last screenshot only 4 resources were added instead of 5 resources. However, in the previous screenshot, it was showing that 5 resources would be added.</w:t>
+      </w:r>
+    </w:p>
+    <w:p/>
     <w:sectPr>
       <w:pgSz w:w="11906" w:h="16838"/>
       <w:pgMar w:top="1440" w:right="1440" w:bottom="1440" w:left="1440" w:header="708" w:footer="708" w:gutter="0"/>
@@ -736,7 +1282,6 @@
   <w:style w:type="character" w:default="1" w:styleId="DefaultParagraphFont">
     <w:name w:val="Default Paragraph Font"/>
     <w:uiPriority w:val="1"/>
-    <w:semiHidden/>
     <w:unhideWhenUsed/>
   </w:style>
   <w:style w:type="table" w:default="1" w:styleId="TableNormal">

</xml_diff>